<commit_message>
feat(convert): 扩展 Pandoc 转 Word 兼容层
- 新增 LaTeX 兼容预处理，支持 glossary、siunitx 和 bm 常用写法。

- 回退编号公式到 Pandoc/Word 原生公式路径，并保留 SVG 公式实验分支。

- 重组文档为英文根 README、docs 中文入口和技术文档索引。

- 更新 temp.tex 示例、reference.docx 样式模板和回归测试。
</commit_message>
<xml_diff>
--- a/reference.docx
+++ b/reference.docx
@@ -41,7 +41,7 @@
         <w:pStyle w:val="LptPaperDate"/>
       </w:pPr>
       <w:r>
-        <w:t xml:space="preserve">2026-06-03</w:t>
+        <w:t xml:space="preserve">2026-06-26</w:t>
       </w:r>
     </w:p>
     <w:p>
@@ -115,7 +115,7 @@
         <w:t xml:space="preserve"> Cross references</w:t>
       </w:r>
     </w:p>
-    <w:bookmarkStart w:id="77" w:name="sec:introduction"/>
+    <w:bookmarkStart w:id="21" w:name="sec:introduction"/>
     <w:p>
       <w:pPr>
         <w:pStyle w:val="LptHeading1"/>
@@ -130,7 +130,7 @@
         <w:t xml:space="preserve"> Introduction</w:t>
       </w:r>
     </w:p>
-    <w:bookmarkEnd w:id="77"/>
+    <w:bookmarkEnd w:id="21"/>
     <w:p>
       <w:pPr>
         <w:pStyle w:val="LptBodyText"/>
@@ -252,7 +252,7 @@
         <w:t xml:space="preserve">summarizes usage suggestions.</w:t>
       </w:r>
     </w:p>
-    <w:bookmarkStart w:id="78" w:name="sec:method"/>
+    <w:bookmarkStart w:id="22" w:name="sec:method"/>
     <w:p>
       <w:pPr>
         <w:pStyle w:val="LptHeading1"/>
@@ -267,8 +267,8 @@
         <w:t xml:space="preserve"> Method</w:t>
       </w:r>
     </w:p>
-    <w:bookmarkEnd w:id="78"/>
-    <w:bookmarkStart w:id="79" w:name="subsec:structure"/>
+    <w:bookmarkEnd w:id="22"/>
+    <w:bookmarkStart w:id="23" w:name="subsec:structure"/>
     <w:p>
       <w:pPr>
         <w:pStyle w:val="LptHeading2"/>
@@ -283,7 +283,7 @@
         <w:t xml:space="preserve"> Manuscript Structure</w:t>
       </w:r>
     </w:p>
-    <w:bookmarkEnd w:id="79"/>
+    <w:bookmarkEnd w:id="23"/>
     <w:p>
       <w:pPr>
         <w:pStyle w:val="LptBodyText"/>
@@ -370,7 +370,7 @@
         <w:t xml:space="preserve">to express hierarchy; figures, tables, and equations use standard floating and mathematical environments.</w:t>
       </w:r>
     </w:p>
-    <w:bookmarkStart w:id="80" w:name="subsubsec:third-level"/>
+    <w:bookmarkStart w:id="24" w:name="subsubsec:third-level"/>
     <w:p>
       <w:pPr>
         <w:pStyle w:val="LptHeading3"/>
@@ -385,7 +385,7 @@
         <w:t xml:space="preserve"> Third-Level Heading Example</w:t>
       </w:r>
     </w:p>
-    <w:bookmarkEnd w:id="80"/>
+    <w:bookmarkEnd w:id="24"/>
     <w:p>
       <w:pPr>
         <w:pStyle w:val="LptBodyText"/>
@@ -400,7 +400,7 @@
         <w:t xml:space="preserve"> A third-level heading can be used to divide methods, experimental conditions, or derivation steps. If the manuscript later needs to be submitted to a journal, it can be migrated to the target journal template at the final stage instead of mixing many layout commands into the draft.</w:t>
       </w:r>
     </w:p>
-    <w:bookmarkStart w:id="81" w:name="subsec:equation"/>
+    <w:bookmarkStart w:id="25" w:name="subsec:equation"/>
     <w:p>
       <w:pPr>
         <w:pStyle w:val="LptHeading2"/>
@@ -415,7 +415,7 @@
         <w:t xml:space="preserve"> Equations and Citations</w:t>
       </w:r>
     </w:p>
-    <w:bookmarkEnd w:id="81"/>
+    <w:bookmarkEnd w:id="25"/>
     <w:p>
       <w:pPr>
         <w:pStyle w:val="LptBodyText"/>
@@ -611,7 +611,582 @@
         <w:t xml:space="preserve">are model parameters. The body text can continue to cite Equation (1), but journal-template-specific custom reference commands are not recommended.</w:t>
       </w:r>
     </w:p>
-    <w:bookmarkStart w:id="82" w:name="sec:results"/>
+    <w:bookmarkStart w:id="26" w:name="subsec:compatibility"/>
+    <w:p>
+      <w:pPr>
+        <w:pStyle w:val="LptHeading2"/>
+      </w:pPr>
+      <w:r>
+        <w:rPr>
+          <w:rFonts w:hint="eastAsia"/>
+        </w:rPr>
+        <w:t xml:space="preserve">转换兼容性示例</w:t>
+      </w:r>
+      <w:r>
+        <w:t xml:space="preserve"> Conversion Compatibility Examples</w:t>
+      </w:r>
+    </w:p>
+    <w:bookmarkEnd w:id="26"/>
+    <w:p>
+      <w:pPr>
+        <w:pStyle w:val="LptBodyText"/>
+      </w:pPr>
+      <w:r>
+        <w:rPr>
+          <w:rFonts w:hint="eastAsia"/>
+        </w:rPr>
+        <w:t xml:space="preserve">本节给出少量转换兼容性示例，用于检查</w:t>
+      </w:r>
+      <w:r>
+        <w:t xml:space="preserve"> Word </w:t>
+      </w:r>
+      <w:r>
+        <w:rPr>
+          <w:rFonts w:hint="eastAsia"/>
+        </w:rPr>
+        <w:t xml:space="preserve">转换前预处理能否展开常用缩略语、符号和单位。示例中，RANS</w:t>
+      </w:r>
+      <w:r>
+        <w:t xml:space="preserve"> </w:t>
+      </w:r>
+      <w:r>
+        <w:rPr>
+          <w:rFonts w:hint="eastAsia"/>
+        </w:rPr>
+        <w:t xml:space="preserve">方法和两个</w:t>
+      </w:r>
+      <w:r>
+        <w:t xml:space="preserve"> UAVs </w:t>
+      </w:r>
+      <w:r>
+        <w:rPr>
+          <w:rFonts w:hint="eastAsia"/>
+        </w:rPr>
+        <w:t xml:space="preserve">共享特征长度</w:t>
+      </w:r>
+      <w:r>
+        <w:t xml:space="preserve"> </w:t>
+      </w:r>
+      <w:r>
+        <w:rPr>
+          <w:rFonts w:hint="eastAsia"/>
+        </w:rPr>
+        <w:t xml:space="preserve">L；采样频率可写为</w:t>
+      </w:r>
+      <w:r>
+        <w:t xml:space="preserve"> 450 </w:t>
+      </w:r>
+      <w:r>
+        <w:rPr>
+          <w:rFonts w:hint="eastAsia"/>
+        </w:rPr>
+        <w:t xml:space="preserve">Hz，频带可写为</w:t>
+      </w:r>
+      <w:r>
+        <w:t xml:space="preserve"> 450–700 </w:t>
+      </w:r>
+      <w:r>
+        <w:rPr>
+          <w:rFonts w:hint="eastAsia"/>
+        </w:rPr>
+        <w:t xml:space="preserve">Hz，角度可写为</w:t>
+      </w:r>
+      <w:r>
+        <w:t xml:space="preserve"> -2°。 The compatibility examples exercise glossary expansion, siunitx-style units, and SVG-rendered equations without relying on journal-specific commands.</w:t>
+      </w:r>
+    </w:p>
+    <w:tbl>
+      <w:tblPr>
+        <w:tblStyle w:val="Table"/>
+        <w:tblW w:type="auto" w:w="0"/>
+        <w:tblLook w:firstRow="0" w:lastRow="0" w:firstColumn="0" w:lastColumn="0" w:noHBand="0" w:noVBand="0" w:val="0000"/>
+        <w:jc w:val="center"/>
+        <w:tblLayout w:type="autofit"/>
+        <w:tblBorders>
+          <w:top w:val="single" w:sz="12" w:space="0" w:color="000000"/>
+          <w:bottom w:val="single" w:sz="12" w:space="0" w:color="000000"/>
+          <w:left w:val="nil"/>
+          <w:right w:val="nil"/>
+          <w:insideH w:val="nil"/>
+          <w:insideV w:val="nil"/>
+        </w:tblBorders>
+      </w:tblPr>
+      <w:tblGrid>
+        <w:gridCol w:w="3960"/>
+        <w:gridCol w:w="3960"/>
+      </w:tblGrid>
+      <w:tr>
+        <w:tc>
+          <w:tcPr>
+            <w:tcBorders>
+              <w:left w:val="nil"/>
+              <w:right w:val="nil"/>
+              <w:insideH w:val="nil"/>
+              <w:insideV w:val="nil"/>
+              <w:top w:val="single" w:sz="12" w:space="0" w:color="000000"/>
+              <w:bottom w:val="single" w:sz="8" w:space="0" w:color="000000"/>
+            </w:tcBorders>
+          </w:tcPr>
+          <w:p>
+            <w:pPr>
+              <w:pStyle w:val="LptTableHeader"/>
+              <w:jc w:val="left"/>
+            </w:pPr>
+            <w:r>
+              <w:rPr>
+                <w:b/>
+                <w:bCs/>
+              </w:rPr>
+              <w:t xml:space="preserve">L</w:t>
+            </w:r>
+          </w:p>
+        </w:tc>
+        <w:tc>
+          <w:tcPr>
+            <w:tcBorders>
+              <w:left w:val="nil"/>
+              <w:right w:val="nil"/>
+              <w:insideH w:val="nil"/>
+              <w:insideV w:val="nil"/>
+              <w:top w:val="single" w:sz="12" w:space="0" w:color="000000"/>
+              <w:bottom w:val="single" w:sz="8" w:space="0" w:color="000000"/>
+            </w:tcBorders>
+          </w:tcPr>
+          <w:p>
+            <w:pPr>
+              <w:pStyle w:val="LptTableHeader"/>
+              <w:jc w:val="left"/>
+            </w:pPr>
+            <w:r>
+              <w:rPr>
+                <w:rFonts w:hint="eastAsia"/>
+              </w:rPr>
+              <w:t xml:space="preserve">示例长度，单位</w:t>
+            </w:r>
+            <w:r>
+              <w:t xml:space="preserve"> m</w:t>
+            </w:r>
+          </w:p>
+        </w:tc>
+      </w:tr>
+    </w:tbl>
+    <w:p/>
+    <w:tbl>
+      <w:tblPr>
+        <w:tblStyle w:val="Table"/>
+        <w:tblW w:type="auto" w:w="0"/>
+        <w:tblLook w:firstRow="0" w:lastRow="0" w:firstColumn="0" w:lastColumn="0" w:noHBand="0" w:noVBand="0" w:val="0000"/>
+        <w:jc w:val="center"/>
+        <w:tblLayout w:type="autofit"/>
+        <w:tblBorders>
+          <w:top w:val="single" w:sz="12" w:space="0" w:color="000000"/>
+          <w:bottom w:val="single" w:sz="12" w:space="0" w:color="000000"/>
+          <w:left w:val="nil"/>
+          <w:right w:val="nil"/>
+          <w:insideH w:val="nil"/>
+          <w:insideV w:val="nil"/>
+        </w:tblBorders>
+      </w:tblPr>
+      <w:tblGrid>
+        <w:gridCol w:w="3960"/>
+        <w:gridCol w:w="3960"/>
+      </w:tblGrid>
+      <w:tr>
+        <w:tc>
+          <w:tcPr>
+            <w:tcBorders>
+              <w:left w:val="nil"/>
+              <w:right w:val="nil"/>
+              <w:insideH w:val="nil"/>
+              <w:insideV w:val="nil"/>
+              <w:top w:val="single" w:sz="12" w:space="0" w:color="000000"/>
+              <w:bottom w:val="single" w:sz="8" w:space="0" w:color="000000"/>
+            </w:tcBorders>
+          </w:tcPr>
+          <w:p>
+            <w:pPr>
+              <w:pStyle w:val="LptTableHeader"/>
+              <w:jc w:val="left"/>
+            </w:pPr>
+            <w:r>
+              <w:rPr>
+                <w:b/>
+                <w:bCs/>
+              </w:rPr>
+              <w:t xml:space="preserve">RANS</w:t>
+            </w:r>
+          </w:p>
+        </w:tc>
+        <w:tc>
+          <w:tcPr>
+            <w:tcBorders>
+              <w:left w:val="nil"/>
+              <w:right w:val="nil"/>
+              <w:insideH w:val="nil"/>
+              <w:insideV w:val="nil"/>
+              <w:top w:val="single" w:sz="12" w:space="0" w:color="000000"/>
+              <w:bottom w:val="single" w:sz="8" w:space="0" w:color="000000"/>
+            </w:tcBorders>
+          </w:tcPr>
+          <w:p>
+            <w:pPr>
+              <w:pStyle w:val="LptTableHeader"/>
+              <w:jc w:val="left"/>
+            </w:pPr>
+            <w:r>
+              <w:t xml:space="preserve">Reynolds-averaged Navier-Stokes</w:t>
+            </w:r>
+          </w:p>
+        </w:tc>
+      </w:tr>
+      <w:tr>
+        <w:tc>
+          <w:tcPr>
+            <w:tcBorders>
+              <w:left w:val="nil"/>
+              <w:right w:val="nil"/>
+              <w:insideH w:val="nil"/>
+              <w:insideV w:val="nil"/>
+              <w:top w:val="nil"/>
+              <w:bottom w:val="single" w:sz="12" w:space="0" w:color="000000"/>
+            </w:tcBorders>
+          </w:tcPr>
+          <w:p>
+            <w:pPr>
+              <w:pStyle w:val="LptTableBody"/>
+              <w:jc w:val="left"/>
+            </w:pPr>
+            <w:r>
+              <w:rPr>
+                <w:b/>
+                <w:bCs/>
+              </w:rPr>
+              <w:t xml:space="preserve">UAV</w:t>
+            </w:r>
+          </w:p>
+        </w:tc>
+        <w:tc>
+          <w:tcPr>
+            <w:tcBorders>
+              <w:left w:val="nil"/>
+              <w:right w:val="nil"/>
+              <w:insideH w:val="nil"/>
+              <w:insideV w:val="nil"/>
+              <w:top w:val="nil"/>
+              <w:bottom w:val="single" w:sz="12" w:space="0" w:color="000000"/>
+            </w:tcBorders>
+          </w:tcPr>
+          <w:p>
+            <w:pPr>
+              <w:pStyle w:val="LptTableBody"/>
+              <w:jc w:val="left"/>
+            </w:pPr>
+            <w:r>
+              <w:t xml:space="preserve">Unmanned Aerial Vehicle</w:t>
+            </w:r>
+          </w:p>
+        </w:tc>
+      </w:tr>
+    </w:tbl>
+    <w:p>
+      <w:pPr>
+        <w:pStyle w:val="LptBodyText"/>
+      </w:pPr>
+      <w:r>
+        <w:rPr>
+          <w:rFonts w:hint="eastAsia"/>
+        </w:rPr>
+        <w:t xml:space="preserve">式(2)和式(3)用于触发复杂公式</w:t>
+      </w:r>
+      <w:r>
+        <w:t xml:space="preserve"> SVG </w:t>
+      </w:r>
+      <w:r>
+        <w:rPr>
+          <w:rFonts w:hint="eastAsia"/>
+        </w:rPr>
+        <w:t xml:space="preserve">渲染。</w:t>
+      </w:r>
+      <w:r>
+        <w:t xml:space="preserve"> Equation (2) and Equation (3) trigger SVG rendering for complex displayed equations.</w:t>
+      </w:r>
+    </w:p>
+    <w:p>
+      <w:pPr>
+        <w:pStyle w:val="LptEquationNumbered"/>
+      </w:pPr>
+      <w:r>
+        <w:tab/>
+      </w:r>
+      <m:oMath>
+        <m:eqArr>
+          <m:e>
+            <m:sSub>
+              <m:e>
+                <m:r>
+                  <m:rPr>
+                    <m:sty m:val="b"/>
+                  </m:rPr>
+                  <m:t>q</m:t>
+                </m:r>
+              </m:e>
+              <m:sub>
+                <m:r>
+                  <m:t>k</m:t>
+                </m:r>
+                <m:r>
+                  <m:rPr>
+                    <m:sty m:val="p"/>
+                  </m:rPr>
+                  <m:t>+</m:t>
+                </m:r>
+                <m:r>
+                  <m:t>1</m:t>
+                </m:r>
+              </m:sub>
+            </m:sSub>
+            <m:r>
+              <m:t>&amp;</m:t>
+            </m:r>
+            <m:r>
+              <m:rPr>
+                <m:sty m:val="p"/>
+              </m:rPr>
+              <m:t>=</m:t>
+            </m:r>
+            <m:r>
+              <m:rPr>
+                <m:sty m:val="b"/>
+              </m:rPr>
+              <m:t>A</m:t>
+            </m:r>
+            <m:sSub>
+              <m:e>
+                <m:r>
+                  <m:rPr>
+                    <m:sty m:val="b"/>
+                  </m:rPr>
+                  <m:t>q</m:t>
+                </m:r>
+              </m:e>
+              <m:sub>
+                <m:r>
+                  <m:t>k</m:t>
+                </m:r>
+              </m:sub>
+            </m:sSub>
+            <m:r>
+              <m:rPr>
+                <m:sty m:val="p"/>
+              </m:rPr>
+              <m:t>+</m:t>
+            </m:r>
+            <m:r>
+              <m:rPr>
+                <m:sty m:val="b"/>
+              </m:rPr>
+              <m:t>b</m:t>
+            </m:r>
+          </m:e>
+          <m:e>
+            <m:sSub>
+              <m:e>
+                <m:r>
+                  <m:t>y</m:t>
+                </m:r>
+              </m:e>
+              <m:sub>
+                <m:r>
+                  <m:t>k</m:t>
+                </m:r>
+              </m:sub>
+            </m:sSub>
+            <m:r>
+              <m:t>&amp;</m:t>
+            </m:r>
+            <m:r>
+              <m:rPr>
+                <m:sty m:val="p"/>
+              </m:rPr>
+              <m:t>=</m:t>
+            </m:r>
+            <m:sSup>
+              <m:e>
+                <m:r>
+                  <m:rPr>
+                    <m:sty m:val="b"/>
+                  </m:rPr>
+                  <m:t>c</m:t>
+                </m:r>
+              </m:e>
+              <m:sup>
+                <m:r>
+                  <m:rPr>
+                    <m:sty m:val="p"/>
+                  </m:rPr>
+                  <m:t>T</m:t>
+                </m:r>
+              </m:sup>
+            </m:sSup>
+            <m:sSub>
+              <m:e>
+                <m:r>
+                  <m:rPr>
+                    <m:sty m:val="b"/>
+                  </m:rPr>
+                  <m:t>q</m:t>
+                </m:r>
+              </m:e>
+              <m:sub>
+                <m:r>
+                  <m:t>k</m:t>
+                </m:r>
+              </m:sub>
+            </m:sSub>
+          </m:e>
+        </m:eqArr>
+      </m:oMath>
+      <w:r>
+        <w:tab/>
+      </w:r>
+      <w:r>
+        <w:t xml:space="preserve">(2)</w:t>
+      </w:r>
+    </w:p>
+    <w:p>
+      <w:pPr>
+        <w:pStyle w:val="LptEquationNumbered"/>
+      </w:pPr>
+      <w:r>
+        <w:tab/>
+      </w:r>
+      <m:oMath>
+        <m:r>
+          <m:t>f</m:t>
+        </m:r>
+        <m:r>
+          <m:rPr>
+            <m:sty m:val="p"/>
+          </m:rPr>
+          <m:t>(</m:t>
+        </m:r>
+        <m:r>
+          <m:t>x</m:t>
+        </m:r>
+        <m:r>
+          <m:rPr>
+            <m:sty m:val="p"/>
+          </m:rPr>
+          <m:t>)</m:t>
+        </m:r>
+        <m:r>
+          <m:rPr>
+            <m:sty m:val="p"/>
+          </m:rPr>
+          <m:t>=</m:t>
+        </m:r>
+        <m:d>
+          <m:dPr>
+            <m:begChr m:val="{"/>
+            <m:sepChr m:val=""/>
+            <m:endChr m:val=""/>
+            <m:grow/>
+          </m:dPr>
+          <m:e>
+            <m:m>
+              <m:mPr>
+                <m:baseJc m:val="center"/>
+                <m:plcHide m:val="on"/>
+                <m:mcs>
+                  <m:mc>
+                    <m:mcPr>
+                      <m:mcJc m:val="left"/>
+                      <m:count m:val="1"/>
+                    </m:mcPr>
+                  </m:mc>
+                  <m:mc>
+                    <m:mcPr>
+                      <m:mcJc m:val="left"/>
+                      <m:count m:val="1"/>
+                    </m:mcPr>
+                  </m:mc>
+                </m:mcs>
+              </m:mPr>
+              <m:mr>
+                <m:e>
+                  <m:r>
+                    <m:t>0</m:t>
+                  </m:r>
+                  <m:r>
+                    <m:rPr>
+                      <m:sty m:val="p"/>
+                    </m:rPr>
+                    <m:t>,</m:t>
+                  </m:r>
+                </m:e>
+                <m:e>
+                  <m:r>
+                    <m:t>x</m:t>
+                  </m:r>
+                  <m:r>
+                    <m:rPr>
+                      <m:sty m:val="p"/>
+                    </m:rPr>
+                    <m:t>&lt;</m:t>
+                  </m:r>
+                  <m:r>
+                    <m:t>0</m:t>
+                  </m:r>
+                </m:e>
+              </m:mr>
+              <m:mr>
+                <m:e>
+                  <m:sSup>
+                    <m:e>
+                      <m:r>
+                        <m:t>x</m:t>
+                      </m:r>
+                    </m:e>
+                    <m:sup>
+                      <m:r>
+                        <m:t>2</m:t>
+                      </m:r>
+                    </m:sup>
+                  </m:sSup>
+                  <m:r>
+                    <m:rPr>
+                      <m:sty m:val="p"/>
+                    </m:rPr>
+                    <m:t>,</m:t>
+                  </m:r>
+                </m:e>
+                <m:e>
+                  <m:r>
+                    <m:t>x</m:t>
+                  </m:r>
+                  <m:r>
+                    <m:rPr>
+                      <m:sty m:val="p"/>
+                    </m:rPr>
+                    <m:t>≥</m:t>
+                  </m:r>
+                  <m:r>
+                    <m:t>0</m:t>
+                  </m:r>
+                </m:e>
+              </m:mr>
+            </m:m>
+          </m:e>
+        </m:d>
+      </m:oMath>
+      <w:r>
+        <w:tab/>
+      </w:r>
+      <w:r>
+        <w:t xml:space="preserve">(3)</w:t>
+      </w:r>
+    </w:p>
+    <w:bookmarkStart w:id="27" w:name="sec:results"/>
     <w:p>
       <w:pPr>
         <w:pStyle w:val="LptHeading1"/>
@@ -626,8 +1201,8 @@
         <w:t xml:space="preserve"> Results and Discussion</w:t>
       </w:r>
     </w:p>
-    <w:bookmarkEnd w:id="82"/>
-    <w:bookmarkStart w:id="83" w:name="subsec:figure"/>
+    <w:bookmarkEnd w:id="27"/>
+    <w:bookmarkStart w:id="28" w:name="subsec:figure"/>
     <w:p>
       <w:pPr>
         <w:pStyle w:val="LptHeading2"/>
@@ -642,7 +1217,7 @@
         <w:t xml:space="preserve"> Figure Examples</w:t>
       </w:r>
     </w:p>
-    <w:bookmarkEnd w:id="83"/>
+    <w:bookmarkEnd w:id="28"/>
     <w:p>
       <w:pPr>
         <w:pStyle w:val="LptBodyText"/>
@@ -684,7 +1259,7 @@
         <w:t xml:space="preserve">and avoid complex patterns such as bilingual caption counter rollback. Note that Word does not support PDF images, so the script first exports PDF images to PNG during processing.</w:t>
       </w:r>
     </w:p>
-    <w:bookmarkStart w:id="87" w:name="fig:vector-format-test-pdf"/>
+    <w:bookmarkStart w:id="32" w:name="fig:vector-format-test-pdf"/>
     <w:p>
       <w:pPr>
         <w:pStyle w:val="CaptionedFigure"/>
@@ -694,18 +1269,18 @@
           <wp:inline>
             <wp:extent cx="2510777" cy="779839"/>
             <wp:effectExtent b="0" l="0" r="0" t="0"/>
-            <wp:docPr descr="" title="" id="85" name="Picture"/>
+            <wp:docPr descr="" title="" id="30" name="Picture"/>
             <a:graphic>
               <a:graphicData uri="http://schemas.openxmlformats.org/drawingml/2006/picture">
                 <pic:pic>
                   <pic:nvPicPr>
-                    <pic:cNvPr descr="example-fig-1-048ca51106-300dpi.png" id="86" name="Picture"/>
+                    <pic:cNvPr descr="example-fig-1-048ca51106-300dpi.png" id="31" name="Picture"/>
                     <pic:cNvPicPr>
                       <a:picLocks noChangeArrowheads="1" noChangeAspect="1"/>
                     </pic:cNvPicPr>
                   </pic:nvPicPr>
                   <pic:blipFill>
-                    <a:blip r:embed="rId84"/>
+                    <a:blip r:embed="rId29"/>
                     <a:stretch>
                       <a:fillRect/>
                     </a:stretch>
@@ -764,8 +1339,8 @@
         <w:t xml:space="preserve"> Figure format test: PDF vector image</w:t>
       </w:r>
     </w:p>
-    <w:bookmarkEnd w:id="87"/>
-    <w:bookmarkStart w:id="91" w:name="fig:vector-format-test-png"/>
+    <w:bookmarkEnd w:id="32"/>
+    <w:bookmarkStart w:id="36" w:name="fig:vector-format-test-png"/>
     <w:p>
       <w:pPr>
         <w:pStyle w:val="CaptionedFigure"/>
@@ -775,18 +1350,18 @@
           <wp:inline>
             <wp:extent cx="2498544" cy="767606"/>
             <wp:effectExtent b="0" l="0" r="0" t="0"/>
-            <wp:docPr descr="" title="" id="89" name="Picture"/>
+            <wp:docPr descr="" title="" id="34" name="Picture"/>
             <a:graphic>
               <a:graphicData uri="http://schemas.openxmlformats.org/drawingml/2006/picture">
                 <pic:pic>
                   <pic:nvPicPr>
-                    <pic:cNvPr descr="example-fig-2.png" id="90" name="Picture"/>
+                    <pic:cNvPr descr="example-fig-2.png" id="35" name="Picture"/>
                     <pic:cNvPicPr>
                       <a:picLocks noChangeArrowheads="1" noChangeAspect="1"/>
                     </pic:cNvPicPr>
                   </pic:nvPicPr>
                   <pic:blipFill>
-                    <a:blip r:embed="rId88"/>
+                    <a:blip r:embed="rId33"/>
                     <a:stretch>
                       <a:fillRect/>
                     </a:stretch>
@@ -845,8 +1420,8 @@
         <w:t xml:space="preserve"> Figure format test: PNG bitmap image</w:t>
       </w:r>
     </w:p>
-    <w:bookmarkEnd w:id="91"/>
-    <w:bookmarkStart w:id="92" w:name="subsec:table"/>
+    <w:bookmarkEnd w:id="36"/>
+    <w:bookmarkStart w:id="37" w:name="subsec:table"/>
     <w:p>
       <w:pPr>
         <w:pStyle w:val="LptHeading2"/>
@@ -861,7 +1436,7 @@
         <w:t xml:space="preserve"> Table Example</w:t>
       </w:r>
     </w:p>
-    <w:bookmarkEnd w:id="92"/>
+    <w:bookmarkEnd w:id="37"/>
     <w:p>
       <w:pPr>
         <w:pStyle w:val="LptBodyText"/>
@@ -972,7 +1547,7 @@
         <w:t xml:space="preserve">; this structure is usually easier to convert than complex merged cells.</w:t>
       </w:r>
     </w:p>
-    <w:bookmarkStart w:id="93" w:name="tab:sample"/>
+    <w:bookmarkStart w:id="38" w:name="tab:sample"/>
     <w:p>
       <w:pPr>
         <w:pStyle w:val="LptTableCaption"/>
@@ -1342,8 +1917,8 @@
         </w:tc>
       </w:tr>
     </w:tbl>
-    <w:bookmarkEnd w:id="93"/>
-    <w:bookmarkStart w:id="94" w:name="subsec:cross-reference"/>
+    <w:bookmarkEnd w:id="38"/>
+    <w:bookmarkStart w:id="39" w:name="subsec:cross-reference"/>
     <w:p>
       <w:pPr>
         <w:pStyle w:val="LptHeading2"/>
@@ -1358,7 +1933,7 @@
         <w:t xml:space="preserve"> Combined Cross-Reference Example</w:t>
       </w:r>
     </w:p>
-    <w:bookmarkEnd w:id="94"/>
+    <w:bookmarkEnd w:id="39"/>
     <w:p>
       <w:pPr>
         <w:pStyle w:val="LptBodyText"/>
@@ -1941,7 +2516,7 @@
         <w:t xml:space="preserve">. During Pandoc-to-Word conversion, these references can be managed through the same BibTeX database.</w:t>
       </w:r>
     </w:p>
-    <w:bookmarkStart w:id="95" w:name="sec:conclusion"/>
+    <w:bookmarkStart w:id="40" w:name="sec:conclusion"/>
     <w:p>
       <w:pPr>
         <w:pStyle w:val="LptHeading1"/>
@@ -1956,7 +2531,7 @@
         <w:t xml:space="preserve"> Conclusion</w:t>
       </w:r>
     </w:p>
-    <w:bookmarkEnd w:id="95"/>
+    <w:bookmarkEnd w:id="40"/>
     <w:p>
       <w:pPr>
         <w:pStyle w:val="LptBodyText"/>
@@ -1982,8 +2557,8 @@
         <w:t xml:space="preserve">参考文献</w:t>
       </w:r>
     </w:p>
-    <w:bookmarkStart w:id="134" w:name="refs"/>
-    <w:bookmarkStart w:id="97" w:name="ref-nightcity2077chipSideChannel"/>
+    <w:bookmarkStart w:id="79" w:name="refs"/>
+    <w:bookmarkStart w:id="42" w:name="ref-nightcity2077chipSideChannel"/>
     <w:p>
       <w:pPr>
         <w:pStyle w:val="LptReferenceItem"/>
@@ -2003,7 +2578,7 @@
       <w:r>
         <w:t xml:space="preserve"> </w:t>
       </w:r>
-      <w:hyperlink r:id="rId96">
+      <w:hyperlink r:id="rId41">
         <w:r>
           <w:rPr>
             <w:rStyle w:val="af"/>
@@ -2015,8 +2590,8 @@
         <w:t xml:space="preserve">.</w:t>
       </w:r>
     </w:p>
-    <w:bookmarkEnd w:id="97"/>
-    <w:bookmarkStart w:id="99" w:name="ref-wang2047flyingBlade"/>
+    <w:bookmarkEnd w:id="42"/>
+    <w:bookmarkStart w:id="44" w:name="ref-wang2047flyingBlade"/>
     <w:p>
       <w:pPr>
         <w:pStyle w:val="LptReferenceItem"/>
@@ -2060,7 +2635,7 @@
       <w:r>
         <w:t xml:space="preserve"> </w:t>
       </w:r>
-      <w:hyperlink r:id="rId98">
+      <w:hyperlink r:id="rId43">
         <w:r>
           <w:rPr>
             <w:rStyle w:val="af"/>
@@ -2072,8 +2647,8 @@
         <w:t xml:space="preserve">.</w:t>
       </w:r>
     </w:p>
-    <w:bookmarkEnd w:id="99"/>
-    <w:bookmarkStart w:id="101" w:name="ref-天庭巡查司648六根封存"/>
+    <w:bookmarkEnd w:id="44"/>
+    <w:bookmarkStart w:id="46" w:name="ref-天庭巡查司648六根封存"/>
     <w:p>
       <w:pPr>
         <w:pStyle w:val="LptReferenceItem"/>
@@ -2132,7 +2707,7 @@
       <w:r>
         <w:t xml:space="preserve"> </w:t>
       </w:r>
-      <w:hyperlink r:id="rId100">
+      <w:hyperlink r:id="rId45">
         <w:r>
           <w:rPr>
             <w:rStyle w:val="af"/>
@@ -2145,8 +2720,8 @@
         <w:t xml:space="preserve">.</w:t>
       </w:r>
     </w:p>
-    <w:bookmarkEnd w:id="101"/>
-    <w:bookmarkStart w:id="102" w:name="ref-logan1023firstFlame"/>
+    <w:bookmarkEnd w:id="46"/>
+    <w:bookmarkStart w:id="47" w:name="ref-logan1023firstFlame"/>
     <w:p>
       <w:pPr>
         <w:pStyle w:val="LptReferenceItem"/>
@@ -2164,8 +2739,8 @@
         <w:t xml:space="preserve">LOGAN B H. Soul-level decay, hollowing dynamics, and vessel relink thresholds under residual first-flame radiation[M]. Vinheim: Vinheim Academy Press, 1023: 1-486.</w:t>
       </w:r>
     </w:p>
-    <w:bookmarkEnd w:id="102"/>
-    <w:bookmarkStart w:id="103" w:name="ref-htt2010teaTimeRules"/>
+    <w:bookmarkEnd w:id="47"/>
+    <w:bookmarkStart w:id="48" w:name="ref-htt2010teaTimeRules"/>
     <w:p>
       <w:pPr>
         <w:pStyle w:val="LptReferenceItem"/>
@@ -2225,8 +2800,8 @@
         <w:t xml:space="preserve"> [S.l.: s.n.], 2010.</w:t>
       </w:r>
     </w:p>
-    <w:bookmarkEnd w:id="103"/>
-    <w:bookmarkStart w:id="104" w:name="ref-senshi514dungeonFoodSystems"/>
+    <w:bookmarkEnd w:id="48"/>
+    <w:bookmarkStart w:id="49" w:name="ref-senshi514dungeonFoodSystems"/>
     <w:p>
       <w:pPr>
         <w:pStyle w:val="LptReferenceItem"/>
@@ -2253,8 +2828,8 @@
         <w:t xml:space="preserve"> 1-372.</w:t>
       </w:r>
     </w:p>
-    <w:bookmarkEnd w:id="104"/>
-    <w:bookmarkStart w:id="106" w:name="ref-二郎642六根分配"/>
+    <w:bookmarkEnd w:id="49"/>
+    <w:bookmarkStart w:id="51" w:name="ref-二郎642六根分配"/>
     <w:p>
       <w:pPr>
         <w:pStyle w:val="LptReferenceItem"/>
@@ -2316,7 +2891,7 @@
       <w:r>
         <w:t xml:space="preserve"> </w:t>
       </w:r>
-      <w:hyperlink r:id="rId105">
+      <w:hyperlink r:id="rId50">
         <w:r>
           <w:rPr>
             <w:rStyle w:val="af"/>
@@ -2329,8 +2904,8 @@
         <w:t xml:space="preserve">.</w:t>
       </w:r>
     </w:p>
-    <w:bookmarkEnd w:id="106"/>
-    <w:bookmarkStart w:id="108" w:name="ref-bridges2039timefallRouting"/>
+    <w:bookmarkEnd w:id="51"/>
+    <w:bookmarkStart w:id="53" w:name="ref-bridges2039timefallRouting"/>
     <w:p>
       <w:pPr>
         <w:pStyle w:val="LptReferenceItem"/>
@@ -2350,7 +2925,7 @@
       <w:r>
         <w:t xml:space="preserve"> </w:t>
       </w:r>
-      <w:hyperlink r:id="rId107">
+      <w:hyperlink r:id="rId52">
         <w:r>
           <w:rPr>
             <w:rStyle w:val="af"/>
@@ -2362,8 +2937,8 @@
         <w:t xml:space="preserve">.</w:t>
       </w:r>
     </w:p>
-    <w:bookmarkEnd w:id="108"/>
-    <w:bookmarkStart w:id="110" w:name="ref-ofnir1320landsBetweenDatabase"/>
+    <w:bookmarkEnd w:id="53"/>
+    <w:bookmarkStart w:id="55" w:name="ref-ofnir1320landsBetweenDatabase"/>
     <w:p>
       <w:pPr>
         <w:pStyle w:val="LptReferenceItem"/>
@@ -2383,7 +2958,7 @@
       <w:r>
         <w:t xml:space="preserve"> </w:t>
       </w:r>
-      <w:hyperlink r:id="rId109">
+      <w:hyperlink r:id="rId54">
         <w:r>
           <w:rPr>
             <w:rStyle w:val="af"/>
@@ -2395,8 +2970,8 @@
         <w:t xml:space="preserve">.</w:t>
       </w:r>
     </w:p>
-    <w:bookmarkEnd w:id="110"/>
-    <w:bookmarkStart w:id="112" w:name="ref-heroAssociation2021disasterDataset"/>
+    <w:bookmarkEnd w:id="55"/>
+    <w:bookmarkStart w:id="57" w:name="ref-heroAssociation2021disasterDataset"/>
     <w:p>
       <w:pPr>
         <w:pStyle w:val="LptReferenceItem"/>
@@ -2416,7 +2991,7 @@
       <w:r>
         <w:t xml:space="preserve"> </w:t>
       </w:r>
-      <w:hyperlink r:id="rId111">
+      <w:hyperlink r:id="rId56">
         <w:r>
           <w:rPr>
             <w:rStyle w:val="af"/>
@@ -2428,8 +3003,8 @@
         <w:t xml:space="preserve">.</w:t>
       </w:r>
     </w:p>
-    <w:bookmarkEnd w:id="112"/>
-    <w:bookmarkStart w:id="114" w:name="ref-alvarez2076braindanceArtifacts"/>
+    <w:bookmarkEnd w:id="57"/>
+    <w:bookmarkStart w:id="59" w:name="ref-alvarez2076braindanceArtifacts"/>
     <w:p>
       <w:pPr>
         <w:pStyle w:val="LptReferenceItem"/>
@@ -2449,7 +3024,7 @@
       <w:r>
         <w:t xml:space="preserve"> </w:t>
       </w:r>
-      <w:hyperlink r:id="rId113">
+      <w:hyperlink r:id="rId58">
         <w:r>
           <w:rPr>
             <w:rStyle w:val="af"/>
@@ -2461,8 +3036,8 @@
         <w:t xml:space="preserve">.</w:t>
       </w:r>
     </w:p>
-    <w:bookmarkEnd w:id="114"/>
-    <w:bookmarkStart w:id="115" w:name="ref-tu550moonEngineChapter"/>
+    <w:bookmarkEnd w:id="59"/>
+    <w:bookmarkStart w:id="60" w:name="ref-tu550moonEngineChapter"/>
     <w:p>
       <w:pPr>
         <w:pStyle w:val="LptReferenceItem"/>
@@ -2495,8 +3070,8 @@
         <w:t xml:space="preserve"> United Earth Government Engineering History Office, 2058: 201-238.</w:t>
       </w:r>
     </w:p>
-    <w:bookmarkEnd w:id="115"/>
-    <w:bookmarkStart w:id="116" w:name="ref-frieren1045memoryMagic"/>
+    <w:bookmarkEnd w:id="60"/>
+    <w:bookmarkStart w:id="61" w:name="ref-frieren1045memoryMagic"/>
     <w:p>
       <w:pPr>
         <w:pStyle w:val="LptReferenceItem"/>
@@ -2514,8 +3089,8 @@
         <w:t xml:space="preserve">FRIEREN, FERN. Memory error in long-lived species, low-frequency mourning behavior, and maintenance of civilian magic catalogues[M]//HEITER, SEIN. Applied Memory Engineering after the Demon King’s Defeat. Äußerst: Central Magic Association Press, 1045: 73-102.</w:t>
       </w:r>
     </w:p>
-    <w:bookmarkEnd w:id="116"/>
-    <w:bookmarkStart w:id="117" w:name="ref-sculptor1579prostheticManual"/>
+    <w:bookmarkEnd w:id="61"/>
+    <w:bookmarkStart w:id="62" w:name="ref-sculptor1579prostheticManual"/>
     <w:p>
       <w:pPr>
         <w:pStyle w:val="LptReferenceItem"/>
@@ -2533,8 +3108,8 @@
         <w:t xml:space="preserve">SCULPTOR T, EMMA. Maintenance of modular shinobi prosthetic mechanisms, tool load matching, and post-inflammatory tissue recovery[M]. Ashina Outskirts: Dilapidated Temple Prosthetic Office, 1579: 1-96.</w:t>
       </w:r>
     </w:p>
-    <w:bookmarkEnd w:id="117"/>
-    <w:bookmarkStart w:id="118" w:name="ref-senshi514goldenCountryMap"/>
+    <w:bookmarkEnd w:id="62"/>
+    <w:bookmarkStart w:id="63" w:name="ref-senshi514goldenCountryMap"/>
     <w:p>
       <w:pPr>
         <w:pStyle w:val="LptReferenceItem"/>
@@ -2582,8 +3157,8 @@
         <w:t xml:space="preserve">514公元.</w:t>
       </w:r>
     </w:p>
-    <w:bookmarkEnd w:id="118"/>
-    <w:bookmarkStart w:id="119" w:name="ref-gotoh2023stageNoise"/>
+    <w:bookmarkEnd w:id="63"/>
+    <w:bookmarkStart w:id="64" w:name="ref-gotoh2023stageNoise"/>
     <w:p>
       <w:pPr>
         <w:pStyle w:val="LptReferenceItem"/>
@@ -2601,8 +3176,8 @@
         <w:t xml:space="preserve">GOTOH H. Correlations among individual anxiety feedback, guitar distortion parameters, and small-band synchronization in low-signal-to-noise stage environments[Z]. [S.l.: s.n.], 2023.</w:t>
       </w:r>
     </w:p>
-    <w:bookmarkEnd w:id="119"/>
-    <w:bookmarkStart w:id="120" w:name="ref-sellen1214primevalCurrent"/>
+    <w:bookmarkEnd w:id="64"/>
+    <w:bookmarkStart w:id="65" w:name="ref-sellen1214primevalCurrent"/>
     <w:p>
       <w:pPr>
         <w:pStyle w:val="LptReferenceItem"/>
@@ -2620,8 +3195,8 @@
         <w:t xml:space="preserve">SELLEN S. Coherent excitation of the primeval current in glintstone cores, consciousness transcription, and the ethical boundary of academy experimentation[Z]. [S.l.: s.n.], 1214.</w:t>
       </w:r>
     </w:p>
-    <w:bookmarkEnd w:id="120"/>
-    <w:bookmarkStart w:id="121" w:name="ref-rubicon621jobFragments"/>
+    <w:bookmarkEnd w:id="65"/>
+    <w:bookmarkStart w:id="66" w:name="ref-rubicon621jobFragments"/>
     <w:p>
       <w:pPr>
         <w:pStyle w:val="LptReferenceItem"/>
@@ -2645,8 +3220,8 @@
         <w:t xml:space="preserve">621公元.</w:t>
       </w:r>
     </w:p>
-    <w:bookmarkEnd w:id="121"/>
-    <w:bookmarkStart w:id="122" w:name="ref-moretti1349divinationRisk"/>
+    <w:bookmarkEnd w:id="66"/>
+    <w:bookmarkStart w:id="67" w:name="ref-moretti1349divinationRisk"/>
     <w:p>
       <w:pPr>
         <w:pStyle w:val="LptReferenceItem"/>
@@ -2679,8 +3254,8 @@
         <w:t xml:space="preserve"> [S.l.: s.n.], 1349.</w:t>
       </w:r>
     </w:p>
-    <w:bookmarkEnd w:id="122"/>
-    <w:bookmarkStart w:id="123" w:name="ref-usagiyama2014steamerFault"/>
+    <w:bookmarkEnd w:id="67"/>
+    <w:bookmarkStart w:id="68" w:name="ref-usagiyama2014steamerFault"/>
     <w:p>
       <w:pPr>
         <w:pStyle w:val="LptReferenceItem"/>
@@ -2698,8 +3273,8 @@
         <w:t xml:space="preserve">USAGIYAMA SHOPPING DISTRICT NEWS. Brief steamer-line failure on mochi festival eve; usagiyama association says supply remains unaffected[Z]. [S.l.: s.n.], 2014.</w:t>
       </w:r>
     </w:p>
-    <w:bookmarkEnd w:id="123"/>
-    <w:bookmarkStart w:id="125" w:name="ref-nakano2011keionGear"/>
+    <w:bookmarkEnd w:id="68"/>
+    <w:bookmarkStart w:id="70" w:name="ref-nakano2011keionGear"/>
     <w:p>
       <w:pPr>
         <w:pStyle w:val="LptReferenceItem"/>
@@ -2719,7 +3294,7 @@
       <w:r>
         <w:t xml:space="preserve"> </w:t>
       </w:r>
-      <w:hyperlink r:id="rId124">
+      <w:hyperlink r:id="rId69">
         <w:r>
           <w:rPr>
             <w:rStyle w:val="af"/>
@@ -2731,8 +3306,8 @@
         <w:t xml:space="preserve">.</w:t>
       </w:r>
     </w:p>
-    <w:bookmarkEnd w:id="125"/>
-    <w:bookmarkStart w:id="126" w:name="ref-gustav1192priorArtTranslation"/>
+    <w:bookmarkEnd w:id="70"/>
+    <w:bookmarkStart w:id="71" w:name="ref-gustav1192priorArtTranslation"/>
     <w:p>
       <w:pPr>
         <w:pStyle w:val="LptReferenceItem"/>
@@ -2750,8 +3325,8 @@
         <w:t xml:space="preserve">GUSTAV R. Method for localizing prior-world technical schemes, reassembling claims, and avoiding mystical negative feedback[Z]. [S.l.: s.n.], 1192.</w:t>
       </w:r>
     </w:p>
-    <w:bookmarkEnd w:id="126"/>
-    <w:bookmarkStart w:id="127" w:name="ref-toyohashi2024makeineSpecial"/>
+    <w:bookmarkEnd w:id="71"/>
+    <w:bookmarkStart w:id="72" w:name="ref-toyohashi2024makeineSpecial"/>
     <w:p>
       <w:pPr>
         <w:pStyle w:val="LptReferenceItem"/>
@@ -2802,8 +3377,8 @@
         <w:t xml:space="preserve"> 2024, 7(8).</w:t>
       </w:r>
     </w:p>
-    <w:bookmarkEnd w:id="127"/>
-    <w:bookmarkStart w:id="128" w:name="ref-ranni1321leyndellSymposium"/>
+    <w:bookmarkEnd w:id="72"/>
+    <w:bookmarkStart w:id="73" w:name="ref-ranni1321leyndellSymposium"/>
     <w:p>
       <w:pPr>
         <w:pStyle w:val="LptReferenceItem"/>
@@ -2824,8 +3399,8 @@
         <w:t xml:space="preserve">. Proceedings of the first leyndell joint symposium on grace measurement, lunar phase, and omen classification[M]. Leyndell: Royal Capital Proceedings Office, 1321: 1-418.</w:t>
       </w:r>
     </w:p>
-    <w:bookmarkEnd w:id="128"/>
-    <w:bookmarkStart w:id="130" w:name="ref-allmind621arenaBench"/>
+    <w:bookmarkEnd w:id="73"/>
+    <w:bookmarkStart w:id="75" w:name="ref-allmind621arenaBench"/>
     <w:p>
       <w:pPr>
         <w:pStyle w:val="LptReferenceItem"/>
@@ -2860,7 +3435,7 @@
       <w:r>
         <w:t xml:space="preserve"> </w:t>
       </w:r>
-      <w:hyperlink r:id="rId129">
+      <w:hyperlink r:id="rId74">
         <w:r>
           <w:rPr>
             <w:rStyle w:val="af"/>
@@ -2872,8 +3447,8 @@
         <w:t xml:space="preserve">.</w:t>
       </w:r>
     </w:p>
-    <w:bookmarkEnd w:id="130"/>
-    <w:bookmarkStart w:id="131" w:name="ref-centrebrain4870dysonInterface"/>
+    <w:bookmarkEnd w:id="75"/>
+    <w:bookmarkStart w:id="76" w:name="ref-centrebrain4870dysonInterface"/>
     <w:p>
       <w:pPr>
         <w:pStyle w:val="LptReferenceItem"/>
@@ -2891,8 +3466,8 @@
         <w:t xml:space="preserve">CENTREBRAIN, ICARUS. Interstellar standard for solar-sail swarm node addressing, ray-receiver safety margin, and dyson-shell assembly interfaces[Z]. [S.l.: s.n.], 4870.</w:t>
       </w:r>
     </w:p>
-    <w:bookmarkEnd w:id="131"/>
-    <w:bookmarkStart w:id="132" w:name="ref-ueg2058heavyFusionScaleup"/>
+    <w:bookmarkEnd w:id="76"/>
+    <w:bookmarkStart w:id="77" w:name="ref-ueg2058heavyFusionScaleup"/>
     <w:p>
       <w:pPr>
         <w:pStyle w:val="LptReferenceItem"/>
@@ -2952,8 +3527,8 @@
         <w:t xml:space="preserve"> 2058.</w:t>
       </w:r>
     </w:p>
-    <w:bookmarkEnd w:id="132"/>
-    <w:bookmarkStart w:id="133" w:name="ref-gotoh2023emergencyStickyNote"/>
+    <w:bookmarkEnd w:id="77"/>
+    <w:bookmarkStart w:id="78" w:name="ref-gotoh2023emergencyStickyNote"/>
     <w:p>
       <w:pPr>
         <w:pStyle w:val="LptReferenceItem"/>
@@ -2971,8 +3546,8 @@
         <w:t xml:space="preserve">GOTOH H, IJICHI N. Bocchi stage-emergency sticky note: Look at nijika, count four beats, and keep the volume below six before disappearing[Z]. [S.l.: s.n.], 2023.</w:t>
       </w:r>
     </w:p>
-    <w:bookmarkEnd w:id="133"/>
-    <w:bookmarkEnd w:id="134"/>
+    <w:bookmarkEnd w:id="78"/>
+    <w:bookmarkEnd w:id="79"/>
     <w:sectPr>
       <w:footnotePr>
         <w:numRestart w:val="eachSect"/>
@@ -3183,7 +3758,6 @@
     <w:lvl w:ilvl="0">
       <w:start w:val="1"/>
       <w:numFmt w:val="decimal"/>
-      <w:pStyle w:val="LptHeading1"/>
       <w:lvlText w:val="%1"/>
       <w:lvlJc w:val="left"/>
       <w:pPr>
@@ -3196,7 +3770,6 @@
     <w:lvl w:ilvl="1">
       <w:start w:val="1"/>
       <w:numFmt w:val="decimal"/>
-      <w:pStyle w:val="LptHeading2"/>
       <w:lvlText w:val="%1.%2"/>
       <w:lvlJc w:val="left"/>
       <w:pPr>
@@ -3209,7 +3782,6 @@
     <w:lvl w:ilvl="2">
       <w:start w:val="1"/>
       <w:numFmt w:val="decimal"/>
-      <w:pStyle w:val="LptHeading3"/>
       <w:lvlText w:val="%1.%2.%3"/>
       <w:lvlJc w:val="left"/>
       <w:pPr>
@@ -3339,8 +3911,10 @@
       </w:pPr>
     </w:lvl>
   </w:abstractNum>
-  <w:abstractNum w:abstractNumId="99">
+  <w:abstractNum ns2:restartNumberingAfterBreak="0" w:abstractNumId="4">
+    <w:nsid w:val="70066944"/>
     <w:multiLevelType w:val="multilevel"/>
+    <w:tmpl w:val="41A2572A"/>
     <w:lvl w:ilvl="0">
       <w:start w:val="1"/>
       <w:numFmt w:val="decimal"/>
@@ -3349,9 +3923,9 @@
       <w:lvlJc w:val="left"/>
       <w:pPr>
         <w:tabs>
-          <w:tab w:val="num" w:pos="360"/>
+          <w:tab w:pos="360" w:val="num"/>
         </w:tabs>
-        <w:ind w:left="360" w:hanging="360"/>
+        <w:ind w:hanging="360" w:left="360"/>
       </w:pPr>
     </w:lvl>
     <w:lvl w:ilvl="1">
@@ -3362,9 +3936,9 @@
       <w:lvlJc w:val="left"/>
       <w:pPr>
         <w:tabs>
-          <w:tab w:val="num" w:pos="540"/>
+          <w:tab w:pos="540" w:val="num"/>
         </w:tabs>
-        <w:ind w:left="540" w:hanging="360"/>
+        <w:ind w:hanging="360" w:left="540"/>
       </w:pPr>
     </w:lvl>
     <w:lvl w:ilvl="2">
@@ -3375,10 +3949,40 @@
       <w:lvlJc w:val="left"/>
       <w:pPr>
         <w:tabs>
-          <w:tab w:val="num" w:pos="720"/>
+          <w:tab w:pos="720" w:val="num"/>
         </w:tabs>
-        <w:ind w:left="720" w:hanging="360"/>
-      </w:pPr>
+        <w:ind w:hanging="360" w:left="720"/>
+      </w:pPr>
+    </w:lvl>
+    <w:lvl w:ilvl="3">
+      <w:numFmt w:val="decimal"/>
+      <w:lvlText w:val=""/>
+      <w:lvlJc w:val="left"/>
+    </w:lvl>
+    <w:lvl w:ilvl="4">
+      <w:numFmt w:val="decimal"/>
+      <w:lvlText w:val=""/>
+      <w:lvlJc w:val="left"/>
+    </w:lvl>
+    <w:lvl w:ilvl="5">
+      <w:numFmt w:val="decimal"/>
+      <w:lvlText w:val=""/>
+      <w:lvlJc w:val="left"/>
+    </w:lvl>
+    <w:lvl w:ilvl="6">
+      <w:numFmt w:val="decimal"/>
+      <w:lvlText w:val=""/>
+      <w:lvlJc w:val="left"/>
+    </w:lvl>
+    <w:lvl w:ilvl="7">
+      <w:numFmt w:val="decimal"/>
+      <w:lvlText w:val=""/>
+      <w:lvlJc w:val="left"/>
+    </w:lvl>
+    <w:lvl w:ilvl="8">
+      <w:numFmt w:val="decimal"/>
+      <w:lvlText w:val=""/>
+      <w:lvlJc w:val="left"/>
     </w:lvl>
   </w:abstractNum>
   <w:abstractNum w:abstractNumId="990">
@@ -3460,11 +4064,59 @@
   <w:num ns3:durableId="2000958245" w:numId="1">
     <w:abstractNumId w:val="2"/>
   </w:num>
-  <w:num w:numId="99">
-    <w:abstractNumId w:val="99"/>
+  <w:num ns3:durableId="1485312545" w:numId="2">
+    <w:abstractNumId w:val="4"/>
+  </w:num>
+  <w:num ns3:durableId="54671412" w:numId="3">
+    <w:abstractNumId w:val="0"/>
   </w:num>
   <w:num w:numId="1000">
     <w:abstractNumId w:val="990"/>
+  </w:num>
+  <w:abstractNum w:abstractNumId="99">
+    <w:multiLevelType w:val="multilevel"/>
+    <w:lvl w:ilvl="0">
+      <w:start w:val="1"/>
+      <w:numFmt w:val="decimal"/>
+      <w:pStyle w:val="LptHeading1"/>
+      <w:lvlText w:val="%1"/>
+      <w:lvlJc w:val="left"/>
+      <w:pPr>
+        <w:tabs>
+          <w:tab w:val="num" w:pos="360"/>
+        </w:tabs>
+        <w:ind w:left="360" w:hanging="360"/>
+      </w:pPr>
+    </w:lvl>
+    <w:lvl w:ilvl="1">
+      <w:start w:val="1"/>
+      <w:numFmt w:val="decimal"/>
+      <w:pStyle w:val="LptHeading2"/>
+      <w:lvlText w:val="%1.%2"/>
+      <w:lvlJc w:val="left"/>
+      <w:pPr>
+        <w:tabs>
+          <w:tab w:val="num" w:pos="540"/>
+        </w:tabs>
+        <w:ind w:left="540" w:hanging="360"/>
+      </w:pPr>
+    </w:lvl>
+    <w:lvl w:ilvl="2">
+      <w:start w:val="1"/>
+      <w:numFmt w:val="decimal"/>
+      <w:pStyle w:val="LptHeading3"/>
+      <w:lvlText w:val="%1.%2.%3"/>
+      <w:lvlJc w:val="left"/>
+      <w:pPr>
+        <w:tabs>
+          <w:tab w:val="num" w:pos="720"/>
+        </w:tabs>
+        <w:ind w:left="720" w:hanging="360"/>
+      </w:pPr>
+    </w:lvl>
+  </w:abstractNum>
+  <w:num w:numId="99">
+    <w:abstractNumId w:val="99"/>
   </w:num>
 </w:numbering>
 </file>
@@ -4531,6 +5183,10 @@
     <w:name w:val="LptTableCaption"/>
     <w:basedOn w:val="LptBodyText"/>
     <w:qFormat/>
+    <w:rsid w:val="004A07E5"/>
+    <w:pPr>
+      <w:jc w:val="center"/>
+    </w:pPr>
   </w:style>
   <w:style w:customStyle="1" w:styleId="LptTableHeader" w:type="paragraph">
     <w:name w:val="LptTableHeader"/>

</xml_diff>